<commit_message>
Add 5 YouTube title options and a plain-text YouTube output
- youtube_titles is now an array of 5 distinct options (strongest
  first) instead of a single title, in both formats.
- generate_summary.py now also writes a companion .txt file with just
  the YouTube-ready block (titles, summary, tools, credits), so it can
  be pasted straight into YouTube without opening the .docx. New
  --txt-output flag to override its path.
- Regenerated the two example outputs to match.

Co-Authored-By: Claude Sonnet 5 <noreply@anthropic.com>
Claude-Session: https://claude.ai/code/session_01EqGeKZNFj2XF58MBNLQXiJ
</commit_message>
<xml_diff>
--- a/gijn_summaries/examples/Carlos_Gao_summary.docx
+++ b/gijn_summaries/examples/Carlos_Gao_summary.docx
@@ -88,13 +88,33 @@
     <w:p/>
     <w:p>
       <w:r>
-        <w:t>YOUTUBE TITLE</w:t>
+        <w:t>YOUTUBE TITLE OPTIONS</w:t>
       </w:r>
     </w:p>
     <w:p/>
     <w:p>
       <w:r>
-        <w:t>How to Protect Yourself from SLAPP Lawsuits: Tips from Media Defence</w:t>
+        <w:t>1. How to Protect Yourself from SLAPP Lawsuits: Tips from Media Defence</w:t>
+      </w:r>
+    </w:p>
+    <w:p>
+      <w:r>
+        <w:t>2. 3 Tips to Defend Journalists Against SLAPP Lawsuits</w:t>
+      </w:r>
+    </w:p>
+    <w:p>
+      <w:r>
+        <w:t>3. What to Do When You're Sued for Your Reporting</w:t>
+      </w:r>
+    </w:p>
+    <w:p>
+      <w:r>
+        <w:t>4. SLAPP Lawsuits Explained: How Journalists Can Fight Back</w:t>
+      </w:r>
+    </w:p>
+    <w:p>
+      <w:r>
+        <w:t>5. Carlos Gao on Surviving a SLAPP Lawsuit as a Journalist</w:t>
       </w:r>
     </w:p>
     <w:p/>

</xml_diff>